<commit_message>
Updated both resume files
</commit_message>
<xml_diff>
--- a/docs/JoshSimpsonResume.docx
+++ b/docs/JoshSimpsonResume.docx
@@ -41,14 +41,12 @@
         <w:rPr/>
         <w:t xml:space="preserve"> | </w:t>
       </w:r>
-      <w:hyperlink r:id="rId4">
-        <w:r>
-          <w:rPr>
-            <w:rStyle w:val="Hyperlink"/>
-          </w:rPr>
-          <w:t>https://www.github.com/joshsimp-uw</w:t>
-        </w:r>
-      </w:hyperlink>
+      <w:r>
+        <w:rPr>
+          <w:rStyle w:val="Hyperlink"/>
+        </w:rPr>
+        <w:t>https://www.github.com/joshsimp-uw</w:t>
+      </w:r>
     </w:p>
     <w:p>
       <w:pPr>
@@ -123,12 +121,13 @@
         <w:jc w:val="start"/>
         <w:rPr>
           <w:i/>
-        </w:rPr>
-      </w:pPr>
-      <w:r>
-        <w:rPr>
           <w:i/>
         </w:rPr>
+      </w:pPr>
+      <w:r>
+        <w:rPr>
+          <w:i/>
+        </w:rPr>
         <w:t>Seminar Leader – TINFO 390 (Seminar for IT Juniors)</w:t>
       </w:r>
     </w:p>
@@ -140,7 +139,6 @@
           <w:numId w:val="2"/>
         </w:numPr>
         <w:tabs>
-          <w:tab w:val="clear" w:pos="709"/>
           <w:tab w:val="left" w:pos="709" w:leader="none"/>
         </w:tabs>
         <w:bidi w:val="0"/>
@@ -161,7 +159,6 @@
           <w:numId w:val="2"/>
         </w:numPr>
         <w:tabs>
-          <w:tab w:val="clear" w:pos="709"/>
           <w:tab w:val="left" w:pos="709" w:leader="none"/>
         </w:tabs>
         <w:bidi w:val="0"/>
@@ -182,7 +179,6 @@
           <w:numId w:val="2"/>
         </w:numPr>
         <w:tabs>
-          <w:tab w:val="clear" w:pos="709"/>
           <w:tab w:val="left" w:pos="709" w:leader="none"/>
         </w:tabs>
         <w:bidi w:val="0"/>
@@ -203,7 +199,6 @@
           <w:numId w:val="2"/>
         </w:numPr>
         <w:tabs>
-          <w:tab w:val="clear" w:pos="709"/>
           <w:tab w:val="left" w:pos="709" w:leader="none"/>
         </w:tabs>
         <w:bidi w:val="0"/>
@@ -253,12 +248,13 @@
         <w:jc w:val="start"/>
         <w:rPr>
           <w:i/>
-        </w:rPr>
-      </w:pPr>
-      <w:r>
-        <w:rPr>
           <w:i/>
         </w:rPr>
+      </w:pPr>
+      <w:r>
+        <w:rPr>
+          <w:i/>
+        </w:rPr>
         <w:t>IT Specialist II</w:t>
       </w:r>
     </w:p>
@@ -270,7 +266,6 @@
           <w:numId w:val="3"/>
         </w:numPr>
         <w:tabs>
-          <w:tab w:val="clear" w:pos="709"/>
           <w:tab w:val="left" w:pos="709" w:leader="none"/>
         </w:tabs>
         <w:bidi w:val="0"/>
@@ -291,7 +286,6 @@
           <w:numId w:val="3"/>
         </w:numPr>
         <w:tabs>
-          <w:tab w:val="clear" w:pos="709"/>
           <w:tab w:val="left" w:pos="709" w:leader="none"/>
         </w:tabs>
         <w:bidi w:val="0"/>
@@ -312,7 +306,6 @@
           <w:numId w:val="3"/>
         </w:numPr>
         <w:tabs>
-          <w:tab w:val="clear" w:pos="709"/>
           <w:tab w:val="left" w:pos="709" w:leader="none"/>
         </w:tabs>
         <w:bidi w:val="0"/>
@@ -333,7 +326,6 @@
           <w:numId w:val="3"/>
         </w:numPr>
         <w:tabs>
-          <w:tab w:val="clear" w:pos="709"/>
           <w:tab w:val="left" w:pos="709" w:leader="none"/>
         </w:tabs>
         <w:bidi w:val="0"/>
@@ -354,7 +346,6 @@
           <w:numId w:val="3"/>
         </w:numPr>
         <w:tabs>
-          <w:tab w:val="clear" w:pos="709"/>
           <w:tab w:val="left" w:pos="709" w:leader="none"/>
         </w:tabs>
         <w:bidi w:val="0"/>
@@ -375,7 +366,6 @@
           <w:numId w:val="3"/>
         </w:numPr>
         <w:tabs>
-          <w:tab w:val="clear" w:pos="709"/>
           <w:tab w:val="left" w:pos="709" w:leader="none"/>
         </w:tabs>
         <w:bidi w:val="0"/>
@@ -396,7 +386,6 @@
           <w:numId w:val="3"/>
         </w:numPr>
         <w:tabs>
-          <w:tab w:val="clear" w:pos="709"/>
           <w:tab w:val="left" w:pos="709" w:leader="none"/>
         </w:tabs>
         <w:bidi w:val="0"/>
@@ -417,7 +406,6 @@
           <w:numId w:val="3"/>
         </w:numPr>
         <w:tabs>
-          <w:tab w:val="clear" w:pos="709"/>
           <w:tab w:val="left" w:pos="709" w:leader="none"/>
         </w:tabs>
         <w:bidi w:val="0"/>
@@ -467,12 +455,13 @@
         <w:jc w:val="start"/>
         <w:rPr>
           <w:i/>
-        </w:rPr>
-      </w:pPr>
-      <w:r>
-        <w:rPr>
           <w:i/>
         </w:rPr>
+      </w:pPr>
+      <w:r>
+        <w:rPr>
+          <w:i/>
+        </w:rPr>
         <w:t>Network &amp; Systems Architect II</w:t>
       </w:r>
     </w:p>
@@ -484,7 +473,6 @@
           <w:numId w:val="4"/>
         </w:numPr>
         <w:tabs>
-          <w:tab w:val="clear" w:pos="709"/>
           <w:tab w:val="left" w:pos="709" w:leader="none"/>
         </w:tabs>
         <w:bidi w:val="0"/>
@@ -505,7 +493,6 @@
           <w:numId w:val="4"/>
         </w:numPr>
         <w:tabs>
-          <w:tab w:val="clear" w:pos="709"/>
           <w:tab w:val="left" w:pos="709" w:leader="none"/>
         </w:tabs>
         <w:bidi w:val="0"/>
@@ -526,7 +513,6 @@
           <w:numId w:val="4"/>
         </w:numPr>
         <w:tabs>
-          <w:tab w:val="clear" w:pos="709"/>
           <w:tab w:val="left" w:pos="709" w:leader="none"/>
         </w:tabs>
         <w:bidi w:val="0"/>
@@ -547,7 +533,6 @@
           <w:numId w:val="4"/>
         </w:numPr>
         <w:tabs>
-          <w:tab w:val="clear" w:pos="709"/>
           <w:tab w:val="left" w:pos="709" w:leader="none"/>
         </w:tabs>
         <w:bidi w:val="0"/>
@@ -568,7 +553,6 @@
           <w:numId w:val="4"/>
         </w:numPr>
         <w:tabs>
-          <w:tab w:val="clear" w:pos="709"/>
           <w:tab w:val="left" w:pos="709" w:leader="none"/>
         </w:tabs>
         <w:bidi w:val="0"/>
@@ -589,7 +573,6 @@
           <w:numId w:val="4"/>
         </w:numPr>
         <w:tabs>
-          <w:tab w:val="clear" w:pos="709"/>
           <w:tab w:val="left" w:pos="709" w:leader="none"/>
         </w:tabs>
         <w:bidi w:val="0"/>
@@ -610,7 +593,6 @@
           <w:numId w:val="4"/>
         </w:numPr>
         <w:tabs>
-          <w:tab w:val="clear" w:pos="709"/>
           <w:tab w:val="left" w:pos="709" w:leader="none"/>
         </w:tabs>
         <w:bidi w:val="0"/>
@@ -660,12 +642,13 @@
         <w:jc w:val="start"/>
         <w:rPr>
           <w:i/>
-        </w:rPr>
-      </w:pPr>
-      <w:r>
-        <w:rPr>
           <w:i/>
         </w:rPr>
+      </w:pPr>
+      <w:r>
+        <w:rPr>
+          <w:i/>
+        </w:rPr>
         <w:t>Technical Representative</w:t>
       </w:r>
     </w:p>
@@ -677,7 +660,6 @@
           <w:numId w:val="5"/>
         </w:numPr>
         <w:tabs>
-          <w:tab w:val="clear" w:pos="709"/>
           <w:tab w:val="left" w:pos="709" w:leader="none"/>
         </w:tabs>
         <w:bidi w:val="0"/>
@@ -698,7 +680,6 @@
           <w:numId w:val="5"/>
         </w:numPr>
         <w:tabs>
-          <w:tab w:val="clear" w:pos="709"/>
           <w:tab w:val="left" w:pos="709" w:leader="none"/>
         </w:tabs>
         <w:bidi w:val="0"/>
@@ -719,7 +700,6 @@
           <w:numId w:val="5"/>
         </w:numPr>
         <w:tabs>
-          <w:tab w:val="clear" w:pos="709"/>
           <w:tab w:val="left" w:pos="709" w:leader="none"/>
         </w:tabs>
         <w:bidi w:val="0"/>
@@ -793,12 +773,13 @@
         <w:jc w:val="start"/>
         <w:rPr>
           <w:i/>
-        </w:rPr>
-      </w:pPr>
-      <w:r>
-        <w:rPr>
           <w:i/>
         </w:rPr>
+      </w:pPr>
+      <w:r>
+        <w:rPr>
+          <w:i/>
+        </w:rPr>
         <w:t>Science Engineering &amp; Technology (SET) &amp; Milgard School of Business combined credential.</w:t>
       </w:r>
     </w:p>
@@ -850,7 +831,6 @@
           <w:numId w:val="6"/>
         </w:numPr>
         <w:tabs>
-          <w:tab w:val="clear" w:pos="709"/>
           <w:tab w:val="left" w:pos="709" w:leader="none"/>
         </w:tabs>
         <w:bidi w:val="0"/>
@@ -871,7 +851,6 @@
           <w:numId w:val="6"/>
         </w:numPr>
         <w:tabs>
-          <w:tab w:val="clear" w:pos="709"/>
           <w:tab w:val="left" w:pos="709" w:leader="none"/>
         </w:tabs>
         <w:bidi w:val="0"/>
@@ -892,7 +871,6 @@
           <w:numId w:val="6"/>
         </w:numPr>
         <w:tabs>
-          <w:tab w:val="clear" w:pos="709"/>
           <w:tab w:val="left" w:pos="709" w:leader="none"/>
         </w:tabs>
         <w:bidi w:val="0"/>
@@ -913,7 +891,6 @@
           <w:numId w:val="6"/>
         </w:numPr>
         <w:tabs>
-          <w:tab w:val="clear" w:pos="709"/>
           <w:tab w:val="left" w:pos="709" w:leader="none"/>
         </w:tabs>
         <w:bidi w:val="0"/>
@@ -974,7 +951,6 @@
           <w:numId w:val="7"/>
         </w:numPr>
         <w:tabs>
-          <w:tab w:val="clear" w:pos="709"/>
           <w:tab w:val="left" w:pos="709" w:leader="none"/>
         </w:tabs>
         <w:bidi w:val="0"/>
@@ -995,7 +971,6 @@
           <w:numId w:val="7"/>
         </w:numPr>
         <w:tabs>
-          <w:tab w:val="clear" w:pos="709"/>
           <w:tab w:val="left" w:pos="709" w:leader="none"/>
         </w:tabs>
         <w:bidi w:val="0"/>
@@ -1056,7 +1031,6 @@
           <w:numId w:val="8"/>
         </w:numPr>
         <w:tabs>
-          <w:tab w:val="clear" w:pos="709"/>
           <w:tab w:val="left" w:pos="709" w:leader="none"/>
         </w:tabs>
         <w:bidi w:val="0"/>
@@ -1077,7 +1051,6 @@
           <w:numId w:val="8"/>
         </w:numPr>
         <w:tabs>
-          <w:tab w:val="clear" w:pos="709"/>
           <w:tab w:val="left" w:pos="709" w:leader="none"/>
         </w:tabs>
         <w:bidi w:val="0"/>
@@ -1110,7 +1083,6 @@
           <w:numId w:val="9"/>
         </w:numPr>
         <w:tabs>
-          <w:tab w:val="clear" w:pos="709"/>
           <w:tab w:val="left" w:pos="709" w:leader="none"/>
         </w:tabs>
         <w:bidi w:val="0"/>
@@ -1137,7 +1109,6 @@
           <w:numId w:val="9"/>
         </w:numPr>
         <w:tabs>
-          <w:tab w:val="clear" w:pos="709"/>
           <w:tab w:val="left" w:pos="709" w:leader="none"/>
         </w:tabs>
         <w:bidi w:val="0"/>
@@ -1164,7 +1135,6 @@
           <w:numId w:val="9"/>
         </w:numPr>
         <w:tabs>
-          <w:tab w:val="clear" w:pos="709"/>
           <w:tab w:val="left" w:pos="709" w:leader="none"/>
         </w:tabs>
         <w:bidi w:val="0"/>
@@ -1191,7 +1161,6 @@
           <w:numId w:val="9"/>
         </w:numPr>
         <w:tabs>
-          <w:tab w:val="clear" w:pos="709"/>
           <w:tab w:val="left" w:pos="709" w:leader="none"/>
         </w:tabs>
         <w:bidi w:val="0"/>
@@ -1218,7 +1187,6 @@
           <w:numId w:val="9"/>
         </w:numPr>
         <w:tabs>
-          <w:tab w:val="clear" w:pos="709"/>
           <w:tab w:val="left" w:pos="709" w:leader="none"/>
         </w:tabs>
         <w:bidi w:val="0"/>
@@ -1245,7 +1213,6 @@
           <w:numId w:val="9"/>
         </w:numPr>
         <w:tabs>
-          <w:tab w:val="clear" w:pos="709"/>
           <w:tab w:val="left" w:pos="709" w:leader="none"/>
         </w:tabs>
         <w:bidi w:val="0"/>
@@ -1284,7 +1251,6 @@
           <w:numId w:val="10"/>
         </w:numPr>
         <w:tabs>
-          <w:tab w:val="clear" w:pos="709"/>
           <w:tab w:val="left" w:pos="709" w:leader="none"/>
         </w:tabs>
         <w:bidi w:val="0"/>
@@ -1311,7 +1277,6 @@
           <w:numId w:val="10"/>
         </w:numPr>
         <w:tabs>
-          <w:tab w:val="clear" w:pos="709"/>
           <w:tab w:val="left" w:pos="709" w:leader="none"/>
         </w:tabs>
         <w:bidi w:val="0"/>
@@ -1338,7 +1303,6 @@
           <w:numId w:val="10"/>
         </w:numPr>
         <w:tabs>
-          <w:tab w:val="clear" w:pos="709"/>
           <w:tab w:val="left" w:pos="709" w:leader="none"/>
         </w:tabs>
         <w:bidi w:val="0"/>
@@ -1377,7 +1341,6 @@
           <w:numId w:val="11"/>
         </w:numPr>
         <w:tabs>
-          <w:tab w:val="clear" w:pos="709"/>
           <w:tab w:val="left" w:pos="709" w:leader="none"/>
         </w:tabs>
         <w:bidi w:val="0"/>
@@ -1404,7 +1367,6 @@
           <w:numId w:val="11"/>
         </w:numPr>
         <w:tabs>
-          <w:tab w:val="clear" w:pos="709"/>
           <w:tab w:val="left" w:pos="709" w:leader="none"/>
         </w:tabs>
         <w:bidi w:val="0"/>
@@ -1431,7 +1393,6 @@
           <w:numId w:val="11"/>
         </w:numPr>
         <w:tabs>
-          <w:tab w:val="clear" w:pos="709"/>
           <w:tab w:val="left" w:pos="709" w:leader="none"/>
         </w:tabs>
         <w:bidi w:val="0"/>
@@ -1458,7 +1419,6 @@
           <w:numId w:val="11"/>
         </w:numPr>
         <w:tabs>
-          <w:tab w:val="clear" w:pos="709"/>
           <w:tab w:val="left" w:pos="709" w:leader="none"/>
         </w:tabs>
         <w:bidi w:val="0"/>
@@ -1527,7 +1487,6 @@
           <w:numId w:val="12"/>
         </w:numPr>
         <w:tabs>
-          <w:tab w:val="clear" w:pos="709"/>
           <w:tab w:val="left" w:pos="709" w:leader="none"/>
         </w:tabs>
         <w:bidi w:val="0"/>
@@ -1548,7 +1507,6 @@
           <w:numId w:val="12"/>
         </w:numPr>
         <w:tabs>
-          <w:tab w:val="clear" w:pos="709"/>
           <w:tab w:val="left" w:pos="709" w:leader="none"/>
         </w:tabs>
         <w:bidi w:val="0"/>
@@ -1569,7 +1527,6 @@
           <w:numId w:val="12"/>
         </w:numPr>
         <w:tabs>
-          <w:tab w:val="clear" w:pos="709"/>
           <w:tab w:val="left" w:pos="709" w:leader="none"/>
         </w:tabs>
         <w:bidi w:val="0"/>
@@ -1602,7 +1559,6 @@
           <w:numId w:val="13"/>
         </w:numPr>
         <w:tabs>
-          <w:tab w:val="clear" w:pos="709"/>
           <w:tab w:val="left" w:pos="709" w:leader="none"/>
         </w:tabs>
         <w:bidi w:val="0"/>
@@ -1646,7 +1602,7 @@
         <w:rPr/>
         <w:t xml:space="preserve"> </w:t>
       </w:r>
-      <w:hyperlink r:id="rId5" w:tgtFrame="_blank">
+      <w:hyperlink r:id="rId3" w:tgtFrame="_blank">
         <w:r>
           <w:rPr>
             <w:rStyle w:val="Hyperlink"/>
@@ -1663,7 +1619,6 @@
           <w:numId w:val="13"/>
         </w:numPr>
         <w:tabs>
-          <w:tab w:val="clear" w:pos="709"/>
           <w:tab w:val="left" w:pos="709" w:leader="none"/>
         </w:tabs>
         <w:bidi w:val="0"/>
@@ -1707,7 +1662,7 @@
         <w:rPr/>
         <w:t xml:space="preserve"> </w:t>
       </w:r>
-      <w:hyperlink r:id="rId6" w:tgtFrame="_blank">
+      <w:hyperlink r:id="rId4" w:tgtFrame="_blank">
         <w:r>
           <w:rPr>
             <w:rStyle w:val="Hyperlink"/>
@@ -1724,7 +1679,6 @@
           <w:numId w:val="13"/>
         </w:numPr>
         <w:tabs>
-          <w:tab w:val="clear" w:pos="709"/>
           <w:tab w:val="left" w:pos="709" w:leader="none"/>
         </w:tabs>
         <w:bidi w:val="0"/>
@@ -1749,6 +1703,7 @@
           <w:numId w:val="0"/>
         </w:numPr>
         <w:bidi w:val="0"/>
+        <w:spacing w:before="0" w:after="140"/>
         <w:ind w:hanging="0" w:start="0"/>
         <w:jc w:val="start"/>
         <w:rPr/>
@@ -1756,17 +1711,6 @@
       <w:r>
         <w:rPr/>
         <w:t>Ongoing development of PowerShell-based automation frameworks for identity management, imaging, and compliance validation.</w:t>
-      </w:r>
-    </w:p>
-    <w:p>
-      <w:pPr>
-        <w:pStyle w:val="Normal"/>
-        <w:bidi w:val="0"/>
-        <w:jc w:val="start"/>
-        <w:rPr/>
-      </w:pPr>
-      <w:r>
-        <w:rPr/>
       </w:r>
     </w:p>
     <w:sectPr>
@@ -1776,6 +1720,7 @@
       <w:pgNumType w:fmt="decimal"/>
       <w:formProt w:val="false"/>
       <w:textDirection w:val="lrTb"/>
+      <w:docGrid w:type="default" w:linePitch="100" w:charSpace="0"/>
     </w:sectPr>
   </w:body>
 </w:document>
@@ -1786,7 +1731,6 @@
   <w:abstractNum w:abstractNumId="1">
     <w:lvl w:ilvl="0">
       <w:start w:val="1"/>
-      <w:pStyle w:val="Heading1"/>
       <w:numFmt w:val="none"/>
       <w:suff w:val="nothing"/>
       <w:lvlText w:val=""/>
@@ -1800,7 +1744,6 @@
     </w:lvl>
     <w:lvl w:ilvl="1">
       <w:start w:val="1"/>
-      <w:pStyle w:val="Heading2"/>
       <w:numFmt w:val="none"/>
       <w:suff w:val="nothing"/>
       <w:lvlText w:val=""/>
@@ -1814,7 +1757,6 @@
     </w:lvl>
     <w:lvl w:ilvl="2">
       <w:start w:val="1"/>
-      <w:pStyle w:val="Heading3"/>
       <w:numFmt w:val="none"/>
       <w:suff w:val="nothing"/>
       <w:lvlText w:val=""/>
@@ -3605,7 +3547,6 @@
     </w:rPrDefault>
     <w:pPrDefault>
       <w:pPr>
-        <w:widowControl/>
         <w:suppressAutoHyphens w:val="true"/>
       </w:pPr>
     </w:pPrDefault>
@@ -3615,7 +3556,10 @@
     <w:qFormat/>
     <w:pPr>
       <w:widowControl/>
+      <w:suppressAutoHyphens w:val="true"/>
       <w:bidi w:val="0"/>
+      <w:spacing w:before="0" w:after="0"/>
+      <w:jc w:val="start"/>
     </w:pPr>
     <w:rPr>
       <w:rFonts w:ascii="Liberation Serif" w:hAnsi="Liberation Serif" w:eastAsia="Noto Serif CJK SC" w:cs="Lucida Sans"/>

</xml_diff>